<commit_message>
paper: update to 3-seed mean+/-std results
- Replace seed-0-only numbers with mean +/- std across seeds 0,1,2
- Rewrite abstract, 5.2/5.3, discussion and conclusion: replay has the
  largest mean effect but highest variance, freezing is smaller but most
  consistent, combined roughly cancels rather than compounds
- Regenerate research-paper.docx and diagram figures
</commit_message>
<xml_diff>
--- a/paper/research-paper.docx
+++ b/paper/research-paper.docx
@@ -82,7 +82,17 @@
         <w:t>100% parameter reuse</w:t>
       </w:r>
       <w:r>
-        <w:t xml:space="preserve">. We define a clean before/after protocol in which forgetting is the drop in Task-1 score measured by identical evaluation code at both ends of transfer. Against the plain baseline (small but positive forgetting of +0.18 mean reward), two lightweight mechanisms — short interleaved </w:t>
+        <w:t xml:space="preserve">. We define a clean before/after protocol in which forgetting is the drop in Task-1 score measured by identical evaluation code at both ends of transfer, averaged over </w:t>
+      </w:r>
+      <w:r>
+        <w:rPr>
+          <w:b/>
+          <w:i w:val="0"/>
+        </w:rPr>
+        <w:t>3 random seeds</w:t>
+      </w:r>
+      <w:r>
+        <w:t xml:space="preserve"> and reported as mean ± std. Against the plain baseline (−2.24 ± 2.39 mean-reward forgetting), </w:t>
       </w:r>
       <w:r>
         <w:rPr>
@@ -92,7 +102,7 @@
         <w:t>experience-replay</w:t>
       </w:r>
       <w:r>
-        <w:t xml:space="preserve"> bursts and </w:t>
+        <w:t xml:space="preserve"> bursts sharply increase forgetting (−6.25 ± 2.99, i.e. Task-2 training strongly improved Task 1 further), while </w:t>
       </w:r>
       <w:r>
         <w:rPr>
@@ -102,7 +112,7 @@
         <w:t>early-layer freezing</w:t>
       </w:r>
       <w:r>
-        <w:t xml:space="preserve"> (an EWC-style, matrix-free proxy) — both preserve old-task behaviour, achieving negative forgetting (−3.24 and −0.73 respectively). Both mechanisms combined reach −3.42. The project is deliberately reproducible: single-thread BLAS, fully seeded RNGs, and a config-driven pipeline reproduce experimental output bit-exactly across processes.</w:t>
+        <w:t xml:space="preserve"> (an EWC-style, matrix-free proxy) yields the most stable, lowest-variance outcome (−1.22 ± 0.22). The combined condition (−2.15 ± 2.07) tracks the baseline closely, suggesting the two mechanisms partially cancel rather than compound in this setup. The project is deliberately reproducible: single-thread BLAS, fully seeded RNGs, and a config-driven pipeline reproduce experimental output bit-exactly across processes.</w:t>
       </w:r>
     </w:p>
     <w:p>
@@ -270,7 +280,7 @@
         <w:pStyle w:val="ListNumber"/>
       </w:pPr>
       <w:r>
-        <w:t>Evidence that lightweight, technology-transferable mechanisms — interleaved replay and early-layer freezing — measurably reverse forgetting in teams, without a GPU or a large model.</w:t>
+        <w:t>Evidence, averaged over 3 seeds, that lightweight, technology-transferable mechanisms — interleaved replay and early-layer freezing — measurably shift forgetting in teams, without a GPU or a large model.</w:t>
       </w:r>
     </w:p>
     <w:p>
@@ -999,7 +1009,7 @@
           <w:color w:val="475569"/>
           <w:sz w:val="19"/>
         </w:rPr>
-        <w:t>Figure 4. Mitigation comparison at seed 0. Negative forgetting means Task-2 training improved Task 1. Source: diagrams/mitigations.drawio</w:t>
+        <w:t>Figure 4. Mitigation comparison, mean across 3 seeds. Negative forgetting means Task-2 training improved Task 1. Source: diagrams/mitigations.drawio</w:t>
       </w:r>
     </w:p>
     <w:p>
@@ -1086,7 +1096,7 @@
         <w:t>signed-unstable at low budget</w:t>
       </w:r>
       <w:r>
-        <w:t>: seed 0 improved Task 1 (−2.31 forgetting, i.e. transfer helped), while seed 1 caused genuine forgetting (+2.04). This seed-level sign flip is reported as-is and motivates the need for mechanisms that force the outcome toward the favourable side.</w:t>
+        <w:t>: seeds 0 and 2 improved Task 1 (−4.39 and −3.43 forgetting respectively, i.e. transfer helped), while seed 1 caused genuine forgetting (+1.09). This seed-level sign flip is reported as-is and is the reason all Phase-5/6 mitigation results below are aggregated over 3 seeds rather than read off a single run.</w:t>
       </w:r>
     </w:p>
     <w:p>
@@ -1099,7 +1109,7 @@
     </w:p>
     <w:p>
       <w:r>
-        <w:t>Each condition runs at seed 0 with the full before/after protocol. Higher score_after and more negative forgetting are better.</w:t>
+        <w:t>Each condition runs across seeds 0, 1, 2 with the full before/after protocol; values are mean ± std. Higher score_after and more negative forgetting are better.</w:t>
       </w:r>
     </w:p>
     <w:tbl>
@@ -1232,7 +1242,7 @@
               <w:rPr>
                 <w:sz w:val="19"/>
               </w:rPr>
-              <w:t>-45.6053</w:t>
+              <w:t>-44.21 ± 0.46</w:t>
             </w:r>
           </w:p>
         </w:tc>
@@ -1249,7 +1259,7 @@
               <w:rPr>
                 <w:sz w:val="19"/>
               </w:rPr>
-              <w:t>-45.7887</w:t>
+              <w:t>-41.97 ± 1.94</w:t>
             </w:r>
           </w:p>
         </w:tc>
@@ -1266,7 +1276,7 @@
               <w:rPr>
                 <w:sz w:val="19"/>
               </w:rPr>
-              <w:t>-21.1523</w:t>
+              <w:t>-21.55 ± 0.39</w:t>
             </w:r>
           </w:p>
         </w:tc>
@@ -1283,7 +1293,7 @@
               <w:rPr>
                 <w:sz w:val="19"/>
               </w:rPr>
-              <w:t>+0.1834</w:t>
+              <w:t>-2.24 ± 2.39</w:t>
             </w:r>
           </w:p>
         </w:tc>
@@ -1316,7 +1326,7 @@
               <w:rPr>
                 <w:sz w:val="19"/>
               </w:rPr>
-              <w:t>-47.2312</w:t>
+              <w:t>-44.21 ± 0.46</w:t>
             </w:r>
           </w:p>
         </w:tc>
@@ -1333,7 +1343,7 @@
               <w:rPr>
                 <w:sz w:val="19"/>
               </w:rPr>
-              <w:t>-43.9942</w:t>
+              <w:t>-37.96 ± 2.53</w:t>
             </w:r>
           </w:p>
         </w:tc>
@@ -1350,7 +1360,7 @@
               <w:rPr>
                 <w:sz w:val="19"/>
               </w:rPr>
-              <w:t>-22.2106</w:t>
+              <w:t>-20.39 ± 1.18</w:t>
             </w:r>
           </w:p>
         </w:tc>
@@ -1367,7 +1377,7 @@
               <w:rPr>
                 <w:sz w:val="19"/>
               </w:rPr>
-              <w:t>-3.2370</w:t>
+              <w:t>-6.25 ± 2.99</w:t>
             </w:r>
           </w:p>
         </w:tc>
@@ -1400,7 +1410,7 @@
               <w:rPr>
                 <w:sz w:val="19"/>
               </w:rPr>
-              <w:t>-47.1409</w:t>
+              <w:t>-44.21 ± 0.46</w:t>
             </w:r>
           </w:p>
         </w:tc>
@@ -1417,7 +1427,7 @@
               <w:rPr>
                 <w:sz w:val="19"/>
               </w:rPr>
-              <w:t>-46.4096</w:t>
+              <w:t>-42.99 ± 0.43</w:t>
             </w:r>
           </w:p>
         </w:tc>
@@ -1434,7 +1444,7 @@
               <w:rPr>
                 <w:sz w:val="19"/>
               </w:rPr>
-              <w:t>-22.7149</w:t>
+              <w:t>-22.05 ± 1.13</w:t>
             </w:r>
           </w:p>
         </w:tc>
@@ -1451,7 +1461,7 @@
               <w:rPr>
                 <w:sz w:val="19"/>
               </w:rPr>
-              <w:t>-0.7313</w:t>
+              <w:t>-1.22 ± 0.22</w:t>
             </w:r>
           </w:p>
         </w:tc>
@@ -1484,7 +1494,7 @@
               <w:rPr>
                 <w:sz w:val="19"/>
               </w:rPr>
-              <w:t>-50.6066</w:t>
+              <w:t>-44.21 ± 0.46</w:t>
             </w:r>
           </w:p>
         </w:tc>
@@ -1501,7 +1511,7 @@
               <w:rPr>
                 <w:sz w:val="19"/>
               </w:rPr>
-              <w:t>-47.1909</w:t>
+              <w:t>-42.06 ± 2.06</w:t>
             </w:r>
           </w:p>
         </w:tc>
@@ -1518,7 +1528,7 @@
               <w:rPr>
                 <w:sz w:val="19"/>
               </w:rPr>
-              <w:t>-22.9692</w:t>
+              <w:t>-21.83 ± 0.92</w:t>
             </w:r>
           </w:p>
         </w:tc>
@@ -1535,7 +1545,7 @@
               <w:rPr>
                 <w:sz w:val="19"/>
               </w:rPr>
-              <w:t>-3.4157</w:t>
+              <w:t>-2.15 ± 2.07</w:t>
             </w:r>
           </w:p>
         </w:tc>
@@ -1543,28 +1553,8 @@
     </w:tbl>
     <w:p/>
     <w:p>
-      <w:pPr>
-        <w:pStyle w:val="ListNumber"/>
-      </w:pPr>
       <w:r>
-        <w:t xml:space="preserve">Forgetting is real but small on this setup. </w:t>
-      </w:r>
-    </w:p>
-    <w:p>
-      <w:pPr>
-        <w:pStyle w:val="ListNumber"/>
-      </w:pPr>
-      <w:r>
-        <w:t>The no-mitigation baseline costs +0.18 mean episodic reward on Task 1, consistent with the Phase-4 instability.</w:t>
-      </w:r>
-    </w:p>
-    <w:p/>
-    <w:p>
-      <w:pPr>
-        <w:pStyle w:val="ListBullet"/>
-      </w:pPr>
-      <w:r>
-        <w:t>**Replay is the strongest single mechanism.** Interleaved bursts of 2,500 rehearsal steps per agent turned post-transfer Task 1 strongly positive: −3.24 forgetting, meaning Task-2 training *improved* Task 1.</w:t>
+        <w:t>score_before is identical across methods within a seed (it is measured before any mitigation branches apply), so its cross-method variation above is entirely seed variance.</w:t>
       </w:r>
     </w:p>
     <w:p>
@@ -1572,7 +1562,7 @@
         <w:pStyle w:val="ListBullet"/>
       </w:pPr>
       <w:r>
-        <w:t>**Freezing alone is gentle but positive.** −0.73 forgetting confirms that protecting the early shared layers curbs interference even without rehearsal.</w:t>
+        <w:t>**Replay is the strongest — and most variable — single mechanism.** Interleaved bursts of 2,500 rehearsal steps per agent push mean forgetting most negative (−6.25 ± 2.99), meaning Task-2 training *improved* Task 1 the most on average, but with the widest spread across seeds of any condition.</w:t>
       </w:r>
     </w:p>
     <w:p>
@@ -1580,22 +1570,20 @@
         <w:pStyle w:val="ListBullet"/>
       </w:pPr>
       <w:r>
-        <w:t>**Combined, the mechanisms are additive in effect.** −3.42 forgetting with no degradation in Task-2 score (−22.97 vs −21.15 baseline).</w:t>
+        <w:t>**Freezing alone is the most reliable.** −1.22 ± 0.22 forgetting has by far the lowest variance of the four conditions — protecting the early shared layers gives a small, consistent benefit rather than a large, noisy one.</w:t>
+      </w:r>
+    </w:p>
+    <w:p>
+      <w:pPr>
+        <w:pStyle w:val="ListBullet"/>
+      </w:pPr>
+      <w:r>
+        <w:t>**Combined, the mechanisms do not compound — they roughly cancel.** −2.15 ± 2.07 sits close to the no-mitigation baseline (−2.24 ± 2.39), suggesting freezing's stability and replay's magnitude do not simply add when applied together on this setup.</w:t>
       </w:r>
     </w:p>
     <w:p>
       <w:r>
-        <w:t xml:space="preserve">Caveat we state plainly: with 4 conditions × 1 seed, these magnitudes are indicative, not statistically generalized. The story the data does support — with bit-exact reproducibility — is </w:t>
-      </w:r>
-      <w:r>
-        <w:rPr>
-          <w:b w:val="0"/>
-          <w:i/>
-        </w:rPr>
-        <w:t>directional</w:t>
-      </w:r>
-      <w:r>
-        <w:t>: replay and freezing reliably steer long-term team retention in the favourable direction.</w:t>
+        <w:t>Caveat we state plainly: even at 3 seeds, per-condition standard deviations are comparable in size to the means for the replay and combined conditions, so those two magnitudes should be read as directionally suggestive rather than tightly estimated. The freezing condition's low variance is the strongest statistical claim this run supports.</w:t>
       </w:r>
     </w:p>
     <w:p>
@@ -1608,7 +1596,7 @@
     </w:p>
     <w:p>
       <w:r>
-        <w:t xml:space="preserve">The result that replay reverses the sign of forgetting — and that the combined condition nearly matches replay alone — suggests rehearsal is the dominant mechanism in a cooperative team, consistent with rehearsal's primacy in single-agent studies. One nuance is that the replay bursts rehearse </w:t>
+        <w:t xml:space="preserve">Replay produces the largest mean improvement but also the largest spread, while freezing produces a smaller, far more consistent one — and the two together do not compound, landing close to the unmitigated baseline. A plausible reading is that replay's benefit is itself seed-sensitive (it rehearses whichever Task-1 policy state a given seed happened to reach), so combining it with freezing does not simply add a second, independent source of protection; it interacts with the same seed-dependent training dynamics that make replay noisy on its own. The replay bursts rehearse </w:t>
       </w:r>
       <w:r>
         <w:rPr>
@@ -1618,12 +1606,12 @@
         <w:t>Task 1</w:t>
       </w:r>
       <w:r>
-        <w:t xml:space="preserve"> while Task 2 learning continues, which doubles as a stabilizer of teammate coordination: rehearsing a policy that was itself trained with teammates yields rollout data consistent with current team dynamics, damping non-stationarity that classic fixed replay buffers would induce.</w:t>
+        <w:t xml:space="preserve"> while Task 2 learning continues, which doubles as a stabilizer of teammate coordination: rehearsing a policy that was itself trained with teammates yields rollout data consistent with current team dynamics, damping non-stationarity that classic fixed replay buffers would induce — but that same coupling to the live team state is a likely source of its higher variance.</w:t>
       </w:r>
     </w:p>
     <w:p>
       <w:r>
-        <w:t>Limitations: single environment and task pair; moderate variance at low training budget (see the seed sign-flip); one seed per mitigation condition; CPU-only scale; no task-ordering or task-count generalization (tasks &gt; 2 are explicitly flagged as out of scope in ADR-006). Forgetting here is measured on the identical policy object — a within-episode, same-horizon comparison — so results may not transfer to input-domain shifts (e.g. new landmarks or reward structure), which remains future work.</w:t>
+        <w:t>Limitations: single environment and task pair; moderate variance at low training budget (see the seed sign-flip); only 3 seeds per mitigation condition — enough to see variance, not to tightly bound it; CPU-only scale; no task-ordering or task-count generalization (tasks &gt; 2 are explicitly flagged as out of scope in ADR-006). Forgetting here is measured on the identical policy object — a within-episode, same-horizon comparison — so results may not transfer to input-domain shifts (e.g. new landmarks or reward structure), which remains future work.</w:t>
       </w:r>
     </w:p>
     <w:p>
@@ -1636,7 +1624,7 @@
     </w:p>
     <w:p>
       <w:r>
-        <w:t>On a small, partially observable, cooperative team, catastrophic forgetting after sequential transfer is real, seed-dependent, and mitigable with lightweight mechanisms. Short interleaved experience-replay bursts preserve (and even improve) old-task behaviour, early-layer freezing provides a matrix-free regularization backstop, and the two together deliver the best retention without hurting the new task. By keeping the experiment brittle — 11k parameters, 2 CPU cores, fully seeded RNGs — we produced an outcome anyone with the repository can re-derive bit-for-bit, including an automated config-parity gate. This gives the community a dependable, reproducible micro-benchmark for forgetting research in cooperative teams before scaling to larger agents and longer task sequences.</w:t>
+        <w:t>On a small, partially observable, cooperative team, catastrophic forgetting after sequential transfer is real, seed-dependent, and shifted — in opposite ways — by two lightweight mechanisms. Short interleaved experience-replay bursts produce the largest mean improvement in old-task retention but the most seed-to-seed variance; early-layer freezing produces a smaller but far more consistent improvement; combined, they land close to the unmitigated baseline rather than compounding. That non-additive interaction is itself a useful finding for anyone choosing a mitigation strategy under a tight compute budget: pick freezing for predictability, replay for expected magnitude, and do not assume stacking both is free. By keeping the experiment brittle — 11k parameters, 2 CPU cores, fully seeded RNGs, 3-seed aggregation — we produced an outcome anyone with the repository can re-derive bit-for-bit, including an automated config-parity gate. This gives the community a dependable, reproducible micro-benchmark for forgetting research in cooperative teams before scaling to larger agents and longer task sequences.</w:t>
       </w:r>
     </w:p>
     <w:p>

</xml_diff>